<commit_message>
Solar: retira grafico de payback da tela e inclui economia/payback no .docx
- Configurador: secao de economia agora mostra so os valores (KPIs); grafico removido
- template.docx: bloco condicional {#temEconomia} apos "Valor total por extenso" com
  economia mensal, economia no 1o ano e payback estimado (some quando nao calculado)
- scripts/patch-solar-template-economia.mjs: patch idempotente documentado
- solarZodSchema + mapper + montarFormData: campos opcionais economiaMensal,
  economiaAno1 e paybackTexto
- validado: render com economia (bloco correto) e sem economia (bloco ausente);
  geracao end-to-end pela UI ok
</commit_message>
<xml_diff>
--- a/src/services/solar/template.docx
+++ b/src/services/solar/template.docx
@@ -2850,6 +2850,57 @@
           <w:szCs w:val="18"/>
         </w:rPr>
         <w:t>{valorTotalExtenso}</w:t>
+      </w:r>
+    </w:p>
+    <w:p>
+      <w:r>
+        <w:t>{#temEconomia}</w:t>
+      </w:r>
+    </w:p>
+    <w:p>
+      <w:pPr>
+        <w:shd w:val="clear" w:color="auto" w:fill="E6F4EA"/>
+        <w:spacing w:before="60" w:after="60"/>
+        <w:ind w:left="120" w:right="120"/>
+      </w:pPr>
+      <w:r>
+        <w:rPr>
+          <w:b/>
+          <w:bCs/>
+          <w:color w:val="1B7A3E"/>
+          <w:sz w:val="18"/>
+          <w:szCs w:val="18"/>
+        </w:rPr>
+        <w:t xml:space="preserve">  Economia estimada: </w:t>
+      </w:r>
+      <w:r>
+        <w:rPr>
+          <w:sz w:val="18"/>
+          <w:szCs w:val="18"/>
+        </w:rPr>
+        <w:t xml:space="preserve">{economiaMensal} por mês — {economiaAno1} no 1º ano</w:t>
+      </w:r>
+      <w:r>
+        <w:rPr>
+          <w:b/>
+          <w:bCs/>
+          <w:color w:val="1B7A3E"/>
+          <w:sz w:val="18"/>
+          <w:szCs w:val="18"/>
+        </w:rPr>
+        <w:t xml:space="preserve">   ·   Payback estimado: </w:t>
+      </w:r>
+      <w:r>
+        <w:rPr>
+          <w:sz w:val="18"/>
+          <w:szCs w:val="18"/>
+        </w:rPr>
+        <w:t>{paybackTexto}</w:t>
+      </w:r>
+    </w:p>
+    <w:p>
+      <w:r>
+        <w:t>{/temEconomia}</w:t>
       </w:r>
     </w:p>
     <w:p>

</xml_diff>